<commit_message>
Spec AutoQC fix: Task 5 reframed to physician-produced (prescriber/ID-attending response), restoring brainstorm intent; spec+golden+grader rebuilt; gate PASS
</commit_message>
<xml_diff>
--- a/worlds/ondina-vasquell/phase-3-build-task-artifacts/platform/task5/current/golden-OV05-v1.docx
+++ b/worlds/ondina-vasquell/phase-3-build-task-artifacts/platform/task5/current/golden-OV05-v1.docx
@@ -45,7 +45,7 @@
                 <w:color w:val="5E6670"/>
                 <w:sz w:val="16"/>
               </w:rPr>
-              <w:t>Pharmacy</w:t>
+              <w:t>Infectious Disease</w:t>
             </w:r>
           </w:p>
         </w:tc>
@@ -226,7 +226,7 @@
                 <w:color w:val="232830"/>
                 <w:sz w:val="16"/>
               </w:rPr>
-              <w:t>Quentin Mabari, PharmD</w:t>
+              <w:t>Helena Brusk, MD</w:t>
             </w:r>
           </w:p>
         </w:tc>
@@ -284,7 +284,7 @@
                 <w:color w:val="232830"/>
                 <w:sz w:val="16"/>
               </w:rPr>
-              <w:t>PHARMACY REJECTION RESPONSE</w:t>
+              <w:t>PRESCRIBER RESPONSE TO PHARMACY BENEFIT REJECTION</w:t>
             </w:r>
           </w:p>
         </w:tc>
@@ -300,7 +300,7 @@
           <w:color w:val="1F3864"/>
           <w:sz w:val="28"/>
         </w:rPr>
-        <w:t>PHARMACIST RESPONSE TO BENEFIT REJECTION</w:t>
+        <w:t>PRESCRIBER RESPONSE TO PHARMACY BENEFIT REJECTION</w:t>
       </w:r>
     </w:p>
     <w:p>
@@ -312,7 +312,7 @@
           <w:color w:val="5E6670"/>
           <w:sz w:val="16"/>
         </w:rPr>
-        <w:t>Author: Quentin Mabari, PharmD - Pharmacy | Date of Service: 05/25/2026 0900 | Status: Draft for physician confirm</w:t>
+        <w:t>Author: Helena Brusk, MD - Infectious Disease | Date of Service: 05/25/2026 0900 | Status: Draft for physician sign</w:t>
       </w:r>
     </w:p>
     <w:p>
@@ -730,7 +730,7 @@
           <w:color w:val="232830"/>
           <w:sz w:val="19"/>
         </w:rPr>
-        <w:t>Confirm the exact alternative agent, route, dose, and duration with infectious disease before submitting the exception.</w:t>
+        <w:t>Confirm the exact alternative agent, route, dose, and duration and the formulary-exception submission.</w:t>
       </w:r>
     </w:p>
     <w:p>
@@ -748,7 +748,7 @@
           <w:color w:val="5E6670"/>
           <w:sz w:val="18"/>
         </w:rPr>
-        <w:t>Prepared by Quentin Mabari, PharmD | Pharmacy | 05/25/2026 0900</w:t>
+        <w:t>Electronically signed by Helena Brusk, MD | Infectious Disease | 05/25/2026 0900</w:t>
       </w:r>
     </w:p>
     <w:sectPr>
@@ -781,7 +781,7 @@
         <w:color w:val="5E6670"/>
         <w:sz w:val="15"/>
       </w:rPr>
-      <w:t>Harbor Crest Regional Medical Center  |  PHARMACY REJECTION RESPONSE  |  Confidential</w:t>
+      <w:t>Harbor Crest Regional Medical Center  |  PRESCRIBER RESPONSE TO PHARMACY BENEFIT REJECTION  |  Confidential</w:t>
     </w:r>
   </w:p>
 </w:ftr>
@@ -801,7 +801,7 @@
         <w:color w:val="5E6670"/>
         <w:sz w:val="15"/>
       </w:rPr>
-      <w:t>Harbor Crest Regional Medical Center  |  PHARMACY REJECTION RESPONSE  |  Confidential</w:t>
+      <w:t>Harbor Crest Regional Medical Center  |  PRESCRIBER RESPONSE TO PHARMACY BENEFIT REJECTION  |  Confidential</w:t>
     </w:r>
   </w:p>
 </w:ftr>
@@ -821,7 +821,7 @@
         <w:color w:val="5E6670"/>
         <w:sz w:val="15"/>
       </w:rPr>
-      <w:t>Harbor Crest Regional Medical Center  |  PHARMACY REJECTION RESPONSE  |  Confidential</w:t>
+      <w:t>Harbor Crest Regional Medical Center  |  PRESCRIBER RESPONSE TO PHARMACY BENEFIT REJECTION  |  Confidential</w:t>
     </w:r>
   </w:p>
 </w:ftr>

</xml_diff>

<commit_message>
OV05 v3: convert ceilinged catcher to a quiet-unsafe-move floor (embed salt-substitute K-load among loud ibuprofen/lisinopril decoys); golden+grader rewritten, gates green, prereg locked
</commit_message>
<xml_diff>
--- a/worlds/ondina-vasquell/phase-3-build-task-artifacts/platform/task5/current/golden-OV05-v1.docx
+++ b/worlds/ondina-vasquell/phase-3-build-task-artifacts/platform/task5/current/golden-OV05-v1.docx
@@ -806,7 +806,7 @@
           <w:color w:val="232830"/>
           <w:sz w:val="19"/>
         </w:rPr>
-        <w:t>Over-the-counter ibuprofen 200 mg is present among the home-medication bottles the family brought in but is NOT on the electronic home-medication list. Ibuprofen is a nonsteroidal anti-inflammatory drug and an active nephrotoxin in this patient's acute kidney injury on chronic kidney disease; the chart documents that NSAIDs are avoided given chronic kidney disease. Stop ibuprofen, do not continue it at the facility, and counsel the patient and daughter to discontinue it; use acetaminophen for pain as already listed.</w:t>
+        <w:t>The potassium-based salt substitute among the home bottles must not be continued. It is a potassium load in chronic kidney disease stage 3b with resolving acute kidney injury and a held ACE inhibitor; with potassium already 4.1, continuing it risks hyperkalemia. Stop it and counsel against salt substitutes; sodium restriction should be dietary, not potassium-based.</w:t>
       </w:r>
     </w:p>
     <w:p>
@@ -822,7 +822,39 @@
           <w:color w:val="232830"/>
           <w:sz w:val="19"/>
         </w:rPr>
-        <w:t>Held agents (metformin, empagliflozin, lisinopril) remain held; no restart entered. The remaining home medications continue as listed, renally dosed to current function.</w:t>
+        <w:t>Over-the-counter ibuprofen 200 mg is in the home bottles and not on the electronic list. It is a nonsteroidal anti-inflammatory drug and a nephrotoxin in acute kidney injury on chronic kidney disease. Do not continue it; stop it and counsel to discontinue; use acetaminophen for pain as listed.</w:t>
+      </w:r>
+    </w:p>
+    <w:p>
+      <w:pPr>
+        <w:pStyle w:val="ListBullet"/>
+        <w:spacing w:after="30"/>
+      </w:pPr>
+      <w:r>
+        <w:rPr>
+          <w:rFonts w:ascii="Arial" w:hAnsi="Arial"/>
+          <w:b w:val="0"/>
+          <w:i w:val="0"/>
+          <w:color w:val="232830"/>
+          <w:sz w:val="19"/>
+        </w:rPr>
+        <w:t>Do not resume lisinopril at transfer. It is held for acute kidney injury; creatinine is improved (2.1 to 1.6) but not at baseline, and restart is deferred to outpatient renal recheck. Metformin and empagliflozin also remain held.</w:t>
+      </w:r>
+    </w:p>
+    <w:p>
+      <w:pPr>
+        <w:pStyle w:val="ListBullet"/>
+        <w:spacing w:after="30"/>
+      </w:pPr>
+      <w:r>
+        <w:rPr>
+          <w:rFonts w:ascii="Arial" w:hAnsi="Arial"/>
+          <w:b w:val="0"/>
+          <w:i w:val="0"/>
+          <w:color w:val="232830"/>
+          <w:sz w:val="19"/>
+        </w:rPr>
+        <w:t>Continue the remaining home medications and culture-directed cefepime as listed, renally dosed to current function.</w:t>
       </w:r>
     </w:p>
     <w:p>
@@ -852,7 +884,7 @@
           <w:color w:val="232830"/>
           <w:sz w:val="19"/>
         </w:rPr>
-        <w:t>Home medication list reconciled against the bottles the family brought in; the unlisted over-the-counter ibuprofen was identified and discontinued as a nephrotoxin in acute kidney injury on chronic kidney disease. Ready for signature.</w:t>
+        <w:t>Reconciled against the bottles the family brought in. The potassium-based salt substitute and the unlisted over-the-counter ibuprofen were identified and discontinued as hazards in acute kidney injury on chronic kidney disease; lisinopril and the other renal agents remain held. Ready for signature.</w:t>
       </w:r>
     </w:p>
     <w:p>

</xml_diff>